<commit_message>
Rework work division so all members share the data science core equally
</commit_message>
<xml_diff>
--- a/proposal/Sinhala_TTS_Proposal.docx
+++ b/proposal/Sinhala_TTS_Proposal.docx
@@ -202,7 +202,14 @@
         <w:t xml:space="preserve"> </w:t>
       </w:r>
       <w:r>
-        <w:t xml:space="preserve">Kusal Pabasara,</w:t>
+        <w:rPr>
+          <w:iCs/>
+          <w:i/>
+        </w:rPr>
+        <w:t xml:space="preserve">Member 1</w:t>
+      </w:r>
+      <w:r>
+        <w:t xml:space="preserve">,</w:t>
       </w:r>
       <w:r>
         <w:t xml:space="preserve"> </w:t>
@@ -1336,13 +1343,50 @@
       </w:r>
     </w:p>
     <w:bookmarkEnd w:id="32"/>
-    <w:bookmarkStart w:id="33" w:name="work-division-3-members"/>
+    <w:bookmarkStart w:id="33" w:name="Xf3fa6e1c5cedd4dbe8c963e420ff1c798aaa84c"/>
     <w:p>
       <w:pPr>
         <w:pStyle w:val="Heading2"/>
       </w:pPr>
       <w:r>
-        <w:t xml:space="preserve">7. Work Division (3 members)</w:t>
+        <w:t xml:space="preserve">7. Work Division (3 members — equal participation in the data science core)</w:t>
+      </w:r>
+    </w:p>
+    <w:p>
+      <w:pPr>
+        <w:pStyle w:val="FirstParagraph"/>
+      </w:pPr>
+      <w:r>
+        <w:t xml:space="preserve">Since this is a</w:t>
+      </w:r>
+      <w:r>
+        <w:t xml:space="preserve"> </w:t>
+      </w:r>
+      <w:r>
+        <w:rPr>
+          <w:iCs/>
+          <w:i/>
+        </w:rPr>
+        <w:t xml:space="preserve">data science</w:t>
+      </w:r>
+      <w:r>
+        <w:t xml:space="preserve"> </w:t>
+      </w:r>
+      <w:r>
+        <w:t xml:space="preserve">project, the division is by</w:t>
+      </w:r>
+      <w:r>
+        <w:t xml:space="preserve"> </w:t>
+      </w:r>
+      <w:r>
+        <w:rPr>
+          <w:bCs/>
+          <w:b/>
+        </w:rPr>
+        <w:t xml:space="preserve">phase, not by role</w:t>
+      </w:r>
+      <w:r>
+        <w:t xml:space="preserve">: every member works on data engineering, modeling, and evaluation. Within each phase, tasks are split into parallel slices of similar weight so each member owns a complete data-science workflow end to end. Software-engineering tasks (app, deployment) are secondary duties spread across all three.</w:t>
       </w:r>
     </w:p>
     <w:tbl>
@@ -1353,9 +1397,10 @@
         <w:jc w:val="start"/>
       </w:tblPr>
       <w:tblGrid>
-        <w:gridCol w:w="2640"/>
-        <w:gridCol w:w="2640"/>
-        <w:gridCol w:w="2640"/>
+        <w:gridCol w:w="1980"/>
+        <w:gridCol w:w="1980"/>
+        <w:gridCol w:w="1980"/>
+        <w:gridCol w:w="1980"/>
       </w:tblGrid>
       <w:tr>
         <w:trPr>
@@ -1369,31 +1414,43 @@
               <w:jc w:val="left"/>
             </w:pPr>
             <w:r>
-              <w:t xml:space="preserve">Member</w:t>
-            </w:r>
-          </w:p>
-        </w:tc>
-        <w:tc>
-          <w:tcPr/>
-          <w:p>
-            <w:pPr>
-              <w:pStyle w:val="Compact"/>
-              <w:jc w:val="left"/>
-            </w:pPr>
-            <w:r>
-              <w:t xml:space="preserve">Role</w:t>
-            </w:r>
-          </w:p>
-        </w:tc>
-        <w:tc>
-          <w:tcPr/>
-          <w:p>
-            <w:pPr>
-              <w:pStyle w:val="Compact"/>
-              <w:jc w:val="left"/>
-            </w:pPr>
-            <w:r>
-              <w:t xml:space="preserve">Responsibilities</w:t>
+              <w:t xml:space="preserve">Phase (all members participate)</w:t>
+            </w:r>
+          </w:p>
+        </w:tc>
+        <w:tc>
+          <w:tcPr/>
+          <w:p>
+            <w:pPr>
+              <w:pStyle w:val="Compact"/>
+              <w:jc w:val="left"/>
+            </w:pPr>
+            <w:r>
+              <w:t xml:space="preserve">Member 1</w:t>
+            </w:r>
+          </w:p>
+        </w:tc>
+        <w:tc>
+          <w:tcPr/>
+          <w:p>
+            <w:pPr>
+              <w:pStyle w:val="Compact"/>
+              <w:jc w:val="left"/>
+            </w:pPr>
+            <w:r>
+              <w:t xml:space="preserve">Member 2</w:t>
+            </w:r>
+          </w:p>
+        </w:tc>
+        <w:tc>
+          <w:tcPr/>
+          <w:p>
+            <w:pPr>
+              <w:pStyle w:val="Compact"/>
+              <w:jc w:val="left"/>
+            </w:pPr>
+            <w:r>
+              <w:t xml:space="preserve">Member 3</w:t>
             </w:r>
           </w:p>
         </w:tc>
@@ -1411,37 +1468,52 @@
                 <w:bCs/>
                 <w:b/>
               </w:rPr>
-              <w:t xml:space="preserve">Member A — Data &amp; Evaluation Lead</w:t>
-            </w:r>
-            <w:r>
-              <w:t xml:space="preserve"> </w:t>
-            </w:r>
-            <w:r>
-              <w:t xml:space="preserve">(Kusal)</w:t>
-            </w:r>
-          </w:p>
-        </w:tc>
-        <w:tc>
-          <w:tcPr/>
-          <w:p>
-            <w:pPr>
-              <w:pStyle w:val="Compact"/>
-              <w:jc w:val="left"/>
-            </w:pPr>
-            <w:r>
-              <w:t xml:space="preserve">Data engineering + evaluation</w:t>
-            </w:r>
-          </w:p>
-        </w:tc>
-        <w:tc>
-          <w:tcPr/>
-          <w:p>
-            <w:pPr>
-              <w:pStyle w:val="Compact"/>
-              <w:jc w:val="left"/>
-            </w:pPr>
-            <w:r>
-              <w:t xml:space="preserve">Dataset acquisition/preprocessing pipeline; corpus statistics &amp; data report; MOS study design and execution; Whisper-WER evaluation harness; data/licensing documentation</w:t>
+              <w:t xml:space="preserve">Data collection &amp; preprocessing</w:t>
+            </w:r>
+          </w:p>
+        </w:tc>
+        <w:tc>
+          <w:tcPr/>
+          <w:p>
+            <w:pPr>
+              <w:pStyle w:val="Compact"/>
+              <w:jc w:val="left"/>
+            </w:pPr>
+            <w:r>
+              <w:t xml:space="preserve">pnfo corpus: cleaning, resampling, splits, corpus statistics</w:t>
+            </w:r>
+          </w:p>
+        </w:tc>
+        <w:tc>
+          <w:tcPr/>
+          <w:p>
+            <w:pPr>
+              <w:pStyle w:val="Compact"/>
+              <w:jc w:val="left"/>
+            </w:pPr>
+            <w:r>
+              <w:t xml:space="preserve">SLR30 + SafnasKaldeen: transcript matching, multi-speaker preprocessing</w:t>
+            </w:r>
+          </w:p>
+        </w:tc>
+        <w:tc>
+          <w:tcPr/>
+          <w:p>
+            <w:pPr>
+              <w:pStyle w:val="Compact"/>
+              <w:jc w:val="left"/>
+            </w:pPr>
+            <w:r>
+              <w:t xml:space="preserve">SLR52: large-scale filtering; FLEURS eval set; text-normalization data (</w:t>
+            </w:r>
+            <w:r>
+              <w:rPr>
+                <w:rStyle w:val="VerbatimChar"/>
+              </w:rPr>
+              <w:t xml:space="preserve">sinhala.grm</w:t>
+            </w:r>
+            <w:r>
+              <w:t xml:space="preserve">, Dakshina)</w:t>
             </w:r>
           </w:p>
         </w:tc>
@@ -1459,31 +1531,43 @@
                 <w:bCs/>
                 <w:b/>
               </w:rPr>
-              <w:t xml:space="preserve">Member B — Modeling Lead</w:t>
-            </w:r>
-          </w:p>
-        </w:tc>
-        <w:tc>
-          <w:tcPr/>
-          <w:p>
-            <w:pPr>
-              <w:pStyle w:val="Compact"/>
-              <w:jc w:val="left"/>
-            </w:pPr>
-            <w:r>
-              <w:t xml:space="preserve">ML training</w:t>
-            </w:r>
-          </w:p>
-        </w:tc>
-        <w:tc>
-          <w:tcPr/>
-          <w:p>
-            <w:pPr>
-              <w:pStyle w:val="Compact"/>
-              <w:jc w:val="left"/>
-            </w:pPr>
-            <w:r>
-              <w:t xml:space="preserve">VITS fine-tuning/training; F5-TTS fine-tuning; baseline reproduction (dialoglk, pnfo checkpoints); training infrastructure (GPU environment, experiment tracking); model selection</w:t>
+              <w:t xml:space="preserve">Exploratory data analysis</w:t>
+            </w:r>
+          </w:p>
+        </w:tc>
+        <w:tc>
+          <w:tcPr/>
+          <w:p>
+            <w:pPr>
+              <w:pStyle w:val="Compact"/>
+              <w:jc w:val="left"/>
+            </w:pPr>
+            <w:r>
+              <w:t xml:space="preserve">Audio quality &amp; duration distributions</w:t>
+            </w:r>
+          </w:p>
+        </w:tc>
+        <w:tc>
+          <w:tcPr/>
+          <w:p>
+            <w:pPr>
+              <w:pStyle w:val="Compact"/>
+              <w:jc w:val="left"/>
+            </w:pPr>
+            <w:r>
+              <w:t xml:space="preserve">Speaker/gender coverage, phonetic coverage analysis</w:t>
+            </w:r>
+          </w:p>
+        </w:tc>
+        <w:tc>
+          <w:tcPr/>
+          <w:p>
+            <w:pPr>
+              <w:pStyle w:val="Compact"/>
+              <w:jc w:val="left"/>
+            </w:pPr>
+            <w:r>
+              <w:t xml:space="preserve">Text statistics: rare syllables, loanwords, numbers frequency</w:t>
             </w:r>
           </w:p>
         </w:tc>
@@ -1501,43 +1585,43 @@
                 <w:bCs/>
                 <w:b/>
               </w:rPr>
-              <w:t xml:space="preserve">Member C — Frontend &amp; Application Lead</w:t>
-            </w:r>
-          </w:p>
-        </w:tc>
-        <w:tc>
-          <w:tcPr/>
-          <w:p>
-            <w:pPr>
-              <w:pStyle w:val="Compact"/>
-              <w:jc w:val="left"/>
-            </w:pPr>
-            <w:r>
-              <w:t xml:space="preserve">TTS frontend + product</w:t>
-            </w:r>
-          </w:p>
-        </w:tc>
-        <w:tc>
-          <w:tcPr/>
-          <w:p>
-            <w:pPr>
-              <w:pStyle w:val="Compact"/>
-              <w:jc w:val="left"/>
-            </w:pPr>
-            <w:r>
-              <w:t xml:space="preserve">Sinhala text normalization module (adapting</w:t>
-            </w:r>
-            <w:r>
-              <w:t xml:space="preserve"> </w:t>
-            </w:r>
-            <w:r>
-              <w:rPr>
-                <w:rStyle w:val="VerbatimChar"/>
-              </w:rPr>
-              <w:t xml:space="preserve">sinhala.grm</w:t>
-            </w:r>
-            <w:r>
-              <w:t xml:space="preserve">); Singlish transliteration input; web application (API + UI); demo deployment; latency/robustness testing</w:t>
+              <w:t xml:space="preserve">Modeling</w:t>
+            </w:r>
+          </w:p>
+        </w:tc>
+        <w:tc>
+          <w:tcPr/>
+          <w:p>
+            <w:pPr>
+              <w:pStyle w:val="Compact"/>
+              <w:jc w:val="left"/>
+            </w:pPr>
+            <w:r>
+              <w:t xml:space="preserve">VITS fine-tuning on pnfo male voice</w:t>
+            </w:r>
+          </w:p>
+        </w:tc>
+        <w:tc>
+          <w:tcPr/>
+          <w:p>
+            <w:pPr>
+              <w:pStyle w:val="Compact"/>
+              <w:jc w:val="left"/>
+            </w:pPr>
+            <w:r>
+              <w:t xml:space="preserve">F5-TTS fine-tuning + comparison</w:t>
+            </w:r>
+          </w:p>
+        </w:tc>
+        <w:tc>
+          <w:tcPr/>
+          <w:p>
+            <w:pPr>
+              <w:pStyle w:val="Compact"/>
+              <w:jc w:val="left"/>
+            </w:pPr>
+            <w:r>
+              <w:t xml:space="preserve">Multi-speaker VITS experiments + reproducing the 3 published baselines</w:t>
             </w:r>
           </w:p>
         </w:tc>
@@ -1555,31 +1639,151 @@
                 <w:bCs/>
                 <w:b/>
               </w:rPr>
-              <w:t xml:space="preserve">All</w:t>
-            </w:r>
-          </w:p>
-        </w:tc>
-        <w:tc>
-          <w:tcPr/>
-          <w:p>
-            <w:pPr>
-              <w:pStyle w:val="Compact"/>
-              <w:jc w:val="left"/>
-            </w:pPr>
-            <w:r>
-              <w:t xml:space="preserve">Shared</w:t>
-            </w:r>
-          </w:p>
-        </w:tc>
-        <w:tc>
-          <w:tcPr/>
-          <w:p>
-            <w:pPr>
-              <w:pStyle w:val="Compact"/>
-              <w:jc w:val="left"/>
-            </w:pPr>
-            <w:r>
-              <w:t xml:space="preserve">Weekly mentor meetings; literature review; paper writing (each member writes their own sections); final report &amp; presentation</w:t>
+              <w:t xml:space="preserve">Evaluation</w:t>
+            </w:r>
+          </w:p>
+        </w:tc>
+        <w:tc>
+          <w:tcPr/>
+          <w:p>
+            <w:pPr>
+              <w:pStyle w:val="Compact"/>
+              <w:jc w:val="left"/>
+            </w:pPr>
+            <w:r>
+              <w:t xml:space="preserve">Whisper-WER automatic evaluation harness</w:t>
+            </w:r>
+          </w:p>
+        </w:tc>
+        <w:tc>
+          <w:tcPr/>
+          <w:p>
+            <w:pPr>
+              <w:pStyle w:val="Compact"/>
+              <w:jc w:val="left"/>
+            </w:pPr>
+            <w:r>
+              <w:t xml:space="preserve">MOS study design, rater recruitment, execution</w:t>
+            </w:r>
+          </w:p>
+        </w:tc>
+        <w:tc>
+          <w:tcPr/>
+          <w:p>
+            <w:pPr>
+              <w:pStyle w:val="Compact"/>
+              <w:jc w:val="left"/>
+            </w:pPr>
+            <w:r>
+              <w:t xml:space="preserve">Error analysis (numbers, loanwords, rare syllables) + statistical significance testing</w:t>
+            </w:r>
+          </w:p>
+        </w:tc>
+      </w:tr>
+      <w:tr>
+        <w:tc>
+          <w:tcPr/>
+          <w:p>
+            <w:pPr>
+              <w:pStyle w:val="Compact"/>
+              <w:jc w:val="left"/>
+            </w:pPr>
+            <w:r>
+              <w:rPr>
+                <w:bCs/>
+                <w:b/>
+              </w:rPr>
+              <w:t xml:space="preserve">Application (secondary)</w:t>
+            </w:r>
+          </w:p>
+        </w:tc>
+        <w:tc>
+          <w:tcPr/>
+          <w:p>
+            <w:pPr>
+              <w:pStyle w:val="Compact"/>
+              <w:jc w:val="left"/>
+            </w:pPr>
+            <w:r>
+              <w:t xml:space="preserve">Inference API backend</w:t>
+            </w:r>
+          </w:p>
+        </w:tc>
+        <w:tc>
+          <w:tcPr/>
+          <w:p>
+            <w:pPr>
+              <w:pStyle w:val="Compact"/>
+              <w:jc w:val="left"/>
+            </w:pPr>
+            <w:r>
+              <w:t xml:space="preserve">Model serving &amp; frontend-model integration</w:t>
+            </w:r>
+          </w:p>
+        </w:tc>
+        <w:tc>
+          <w:tcPr/>
+          <w:p>
+            <w:pPr>
+              <w:pStyle w:val="Compact"/>
+              <w:jc w:val="left"/>
+            </w:pPr>
+            <w:r>
+              <w:t xml:space="preserve">Web UI + demo deployment</w:t>
+            </w:r>
+          </w:p>
+        </w:tc>
+      </w:tr>
+      <w:tr>
+        <w:tc>
+          <w:tcPr/>
+          <w:p>
+            <w:pPr>
+              <w:pStyle w:val="Compact"/>
+              <w:jc w:val="left"/>
+            </w:pPr>
+            <w:r>
+              <w:rPr>
+                <w:bCs/>
+                <w:b/>
+              </w:rPr>
+              <w:t xml:space="preserve">Paper &amp; report</w:t>
+            </w:r>
+          </w:p>
+        </w:tc>
+        <w:tc>
+          <w:tcPr/>
+          <w:p>
+            <w:pPr>
+              <w:pStyle w:val="Compact"/>
+              <w:jc w:val="left"/>
+            </w:pPr>
+            <w:r>
+              <w:t xml:space="preserve">Data &amp; experimental-setup sections</w:t>
+            </w:r>
+          </w:p>
+        </w:tc>
+        <w:tc>
+          <w:tcPr/>
+          <w:p>
+            <w:pPr>
+              <w:pStyle w:val="Compact"/>
+              <w:jc w:val="left"/>
+            </w:pPr>
+            <w:r>
+              <w:t xml:space="preserve">Modeling &amp; results sections</w:t>
+            </w:r>
+          </w:p>
+        </w:tc>
+        <w:tc>
+          <w:tcPr/>
+          <w:p>
+            <w:pPr>
+              <w:pStyle w:val="Compact"/>
+              <w:jc w:val="left"/>
+            </w:pPr>
+            <w:r>
+              <w:t xml:space="preserve">Evaluation, error-analysis &amp; related-work sections</w:t>
             </w:r>
           </w:p>
         </w:tc>
@@ -1590,20 +1794,20 @@
         <w:pStyle w:val="BodyText"/>
       </w:pPr>
       <w:r>
-        <w:t xml:space="preserve">Ownership is by</w:t>
+        <w:t xml:space="preserve">Members pair on blockers across slices, and slice assignments can be swapped by agreement — the constraint is that</w:t>
       </w:r>
       <w:r>
         <w:t xml:space="preserve"> </w:t>
       </w:r>
       <w:r>
         <w:rPr>
-          <w:iCs/>
-          <w:i/>
+          <w:bCs/>
+          <w:b/>
         </w:rPr>
-        <w:t xml:space="preserve">deliverable</w:t>
-      </w:r>
-      <w:r>
-        <w:t xml:space="preserve">, but members are expected to pair on blockers (e.g., B+C on integrating the frontend with the model, A+B on data ablation experiments).</w:t>
+        <w:t xml:space="preserve">each member ends the project having done data work, model training, and evaluation</w:t>
+      </w:r>
+      <w:r>
+        <w:t xml:space="preserve">, which is also what each of us should be able to defend at the viva.</w:t>
       </w:r>
     </w:p>
     <w:bookmarkEnd w:id="33"/>

</xml_diff>